<commit_message>
Clarify literature roles in magnesium interface discussion
</commit_message>
<xml_diff>
--- a/perspective_v2/Magnesium_Perspective_V2.docx
+++ b/perspective_v2/Magnesium_Perspective_V2.docx
@@ -1353,7 +1353,7 @@
         <w:jc w:val="both"/>
       </w:pPr>
       <w:r>
-        <w:t>Adsorption, chemical stabilization of solution species, and interphase formation provide distinct routes to compatibility. Chloride-containing formulations have motivated analyses of adsorbed species and their effects on passivation.</w:t>
+        <w:t>Adsorption, chemical stabilization of solution species, and interphase formation provide distinct routes to compatibility. Studies of controlled surface passivation, intermediate adsorption, borohydride-derived interphases, deposition morphology and hybrid-solvent chemistry illustrate distinct approaches to preserving magnesium transfer.</w:t>
       </w:r>
       <w:r>
         <w:rPr>
@@ -1388,7 +1388,7 @@
           <w:sz w:val="16"/>
           <w:vertAlign w:val="superscript"/>
         </w:rPr>
-        <w:t>[20–21,30,53]</w:t>
+        <w:t>[21,23,30,53,76]</w:t>
       </w:r>
       <w:r>
         <w:t xml:space="preserve"> A low calculated migration barrier in an ideal crystal cannot by itself identify the transport pathway through a heterogeneous electrochemical film. Similarly, detection of a decomposition product should not be equated automatically with either beneficial protection or complete passivation.</w:t>

</xml_diff>